<commit_message>
Agrega el logo de Un Cerebro Diferente a la portada del documento técnico
Reemplaza el emoji 🧠 de la portada por el isotipo real de la marca
(documentacion/assets_manual/isotipo.png).

Co-Authored-By: Claude Sonnet 5 <noreply@anthropic.com>
</commit_message>
<xml_diff>
--- a/documentacion/neurokit_documento_tecnico_funcional.docx
+++ b/documentacion/neurokit_documento_tecnico_funcional.docx
@@ -8,11 +8,41 @@
         <w:jc w:val="center"/>
       </w:pPr>
       <w:r>
-        <w:rPr>
-          <w:sz w:val="96"/>
-          <w:szCs w:val="96"/>
-        </w:rPr>
-        <w:t>🧠</w:t>
+        <w:drawing>
+          <wp:inline distT="0" distB="0" distL="0" distR="0">
+            <wp:extent cx="1426000" cy="1187000"/>
+            <wp:effectExtent l="0" t="0" r="0" b="0"/>
+            <wp:docPr id="1" name="Logo Un Cerebro Diferente"/>
+            <wp:cNvGraphicFramePr>
+              <a:graphicFrameLocks xmlns:a="http://schemas.openxmlformats.org/drawingml/2006/main" noChangeAspect="1"/>
+            </wp:cNvGraphicFramePr>
+            <a:graphic xmlns:a="http://schemas.openxmlformats.org/drawingml/2006/main">
+              <a:graphicData uri="http://schemas.openxmlformats.org/drawingml/2006/picture">
+                <pic:pic xmlns:pic="http://schemas.openxmlformats.org/drawingml/2006/picture">
+                  <pic:nvPicPr>
+                    <pic:cNvPr id="1" name="isotipo.png"/>
+                    <pic:cNvPicPr/>
+                  </pic:nvPicPr>
+                  <pic:blipFill>
+                    <a:blip r:embed="rId7"/>
+                    <a:stretch>
+                      <a:fillRect/>
+                    </a:stretch>
+                  </pic:blipFill>
+                  <pic:spPr>
+                    <a:xfrm>
+                      <a:off x="0" y="0"/>
+                      <a:ext cx="1426000" cy="1187000"/>
+                    </a:xfrm>
+                    <a:prstGeom prst="rect">
+                      <a:avLst/>
+                    </a:prstGeom>
+                  </pic:spPr>
+                </pic:pic>
+              </a:graphicData>
+            </a:graphic>
+          </wp:inline>
+        </w:drawing>
       </w:r>
     </w:p>
     <w:p>

</xml_diff>